<commit_message>
Highlight unfilled fields in red
</commit_message>
<xml_diff>
--- a/src/ked_builder/templates/ked_template.docx
+++ b/src/ked_builder/templates/ked_template.docx
@@ -442,7 +442,7 @@
                 <w:position w:val="-6"/>
                 <w:sz w:val="28"/>
                 <w:szCs w:val="28"/>
-                <w:lang w:val="kk-KZ"/>
+                <w:highlight w:val="red"/>
               </w:rPr>
             </w:pPr>
             <w:r>
@@ -451,6 +451,7 @@
                 <w:position w:val="-6"/>
                 <w:sz w:val="28"/>
                 <w:szCs w:val="28"/>
+                <w:highlight w:val="red"/>
                 <w:lang w:val="kk-KZ"/>
               </w:rPr>
               <w:t xml:space="preserve">Председатель УМС</w:t>
@@ -461,6 +462,7 @@
                 <w:position w:val="-6"/>
                 <w:sz w:val="28"/>
                 <w:szCs w:val="28"/>
+                <w:highlight w:val="red"/>
                 <w:lang w:val="kk-KZ"/>
               </w:rPr>
             </w:r>
@@ -470,6 +472,7 @@
                 <w:position w:val="-6"/>
                 <w:sz w:val="28"/>
                 <w:szCs w:val="28"/>
+                <w:highlight w:val="red"/>
                 <w:lang w:val="kk-KZ"/>
               </w:rPr>
             </w:r>
@@ -484,7 +487,7 @@
                 <w:position w:val="-6"/>
                 <w:sz w:val="28"/>
                 <w:szCs w:val="28"/>
-                <w:lang w:val="kk-KZ"/>
+                <w:highlight w:val="red"/>
               </w:rPr>
             </w:pPr>
             <w:r>
@@ -492,6 +495,7 @@
                 <w:position w:val="-6"/>
                 <w:sz w:val="28"/>
                 <w:szCs w:val="28"/>
+                <w:highlight w:val="red"/>
                 <w:lang w:val="kk-KZ"/>
               </w:rPr>
               <w:t xml:space="preserve">________ Ж.Ошакбаева </w:t>
@@ -501,6 +505,7 @@
                 <w:position w:val="-6"/>
                 <w:sz w:val="28"/>
                 <w:szCs w:val="28"/>
+                <w:highlight w:val="red"/>
                 <w:lang w:val="kk-KZ"/>
               </w:rPr>
             </w:r>
@@ -509,6 +514,7 @@
                 <w:position w:val="-6"/>
                 <w:sz w:val="28"/>
                 <w:szCs w:val="28"/>
+                <w:highlight w:val="red"/>
                 <w:lang w:val="kk-KZ"/>
               </w:rPr>
             </w:r>
@@ -523,7 +529,7 @@
                 <w:position w:val="-6"/>
                 <w:sz w:val="28"/>
                 <w:szCs w:val="28"/>
-                <w:lang w:val="kk-KZ"/>
+                <w:highlight w:val="red"/>
               </w:rPr>
             </w:pPr>
             <w:r>
@@ -531,6 +537,7 @@
                 <w:position w:val="-6"/>
                 <w:sz w:val="28"/>
                 <w:szCs w:val="28"/>
+                <w:highlight w:val="red"/>
                 <w:lang w:val="kk-KZ"/>
               </w:rPr>
               <w:t xml:space="preserve">«</w:t>
@@ -540,6 +547,7 @@
                 <w:position w:val="-6"/>
                 <w:sz w:val="28"/>
                 <w:szCs w:val="28"/>
+                <w:highlight w:val="red"/>
                 <w:u w:val="single"/>
                 <w:lang w:val="kk-KZ"/>
               </w:rPr>
@@ -550,6 +558,7 @@
                 <w:position w:val="-6"/>
                 <w:sz w:val="28"/>
                 <w:szCs w:val="28"/>
+                <w:highlight w:val="red"/>
                 <w:lang w:val="kk-KZ"/>
               </w:rPr>
               <w:t xml:space="preserve">» </w:t>
@@ -559,6 +568,7 @@
                 <w:position w:val="-6"/>
                 <w:sz w:val="28"/>
                 <w:szCs w:val="28"/>
+                <w:highlight w:val="red"/>
                 <w:u w:val="single"/>
                 <w:lang w:val="kk-KZ"/>
               </w:rPr>
@@ -569,6 +579,7 @@
                 <w:position w:val="-6"/>
                 <w:sz w:val="28"/>
                 <w:szCs w:val="28"/>
+                <w:highlight w:val="red"/>
                 <w:lang w:val="kk-KZ"/>
               </w:rPr>
               <w:t xml:space="preserve"> </w:t>
@@ -578,6 +589,7 @@
                 <w:position w:val="-6"/>
                 <w:sz w:val="28"/>
                 <w:szCs w:val="28"/>
+                <w:highlight w:val="red"/>
                 <w:lang w:val="en-US"/>
               </w:rPr>
               <w:t xml:space="preserve">[YEAR]</w:t>
@@ -587,6 +599,7 @@
                 <w:position w:val="-6"/>
                 <w:sz w:val="28"/>
                 <w:szCs w:val="28"/>
+                <w:highlight w:val="red"/>
                 <w:lang w:val="kk-KZ"/>
               </w:rPr>
               <w:t xml:space="preserve"> ж. / г.</w:t>
@@ -596,6 +609,7 @@
                 <w:position w:val="-6"/>
                 <w:sz w:val="28"/>
                 <w:szCs w:val="28"/>
+                <w:highlight w:val="red"/>
                 <w:lang w:val="kk-KZ"/>
               </w:rPr>
             </w:r>
@@ -604,6 +618,7 @@
                 <w:position w:val="-6"/>
                 <w:sz w:val="28"/>
                 <w:szCs w:val="28"/>
+                <w:highlight w:val="red"/>
                 <w:lang w:val="kk-KZ"/>
               </w:rPr>
             </w:r>
@@ -1072,6 +1087,15 @@
           <w:lang w:val="kk-KZ"/>
         </w:rPr>
       </w:r>
+      <w:r>
+        <w:rPr>
+          <w:b/>
+          <w:bCs/>
+          <w:sz w:val="28"/>
+          <w:szCs w:val="28"/>
+          <w:lang w:val="kk-KZ"/>
+        </w:rPr>
+      </w:r>
     </w:p>
     <w:p>
       <w:pPr>
@@ -1102,8 +1126,6 @@
       <w:r>
         <w:t xml:space="preserve">үшін</w:t>
       </w:r>
-      <w:bookmarkEnd w:id="0"/>
-      <w:r/>
       <w:r/>
     </w:p>
     <w:p>
@@ -1274,6 +1296,13 @@
           <w:lang w:val="kk-KZ"/>
         </w:rPr>
       </w:r>
+      <w:r>
+        <w:rPr>
+          <w:sz w:val="28"/>
+          <w:szCs w:val="28"/>
+          <w:lang w:val="kk-KZ"/>
+        </w:rPr>
+      </w:r>
     </w:p>
     <w:p>
       <w:pPr>
@@ -2322,6 +2351,7 @@
       </w:r>
       <w:r>
         <w:rPr>
+          <w:highlight w:val="red"/>
           <w:lang w:val="en-US"/>
         </w:rPr>
         <w:t xml:space="preserve">[YEAR]</w:t>
@@ -2365,22 +2395,32 @@
         <w:rPr>
           <w:lang w:val="kk-KZ"/>
         </w:rPr>
-        <w:t xml:space="preserve">М. Дулатов атындағы ҚИнЭУ-дың оқу–әдістемелік кеңес отырысында бекітілді,    26.03.</w:t>
-      </w:r>
-      <w:r>
-        <w:rPr>
+        <w:t xml:space="preserve">М. Дулатов атындағы ҚИнЭУ-дың оқу–әдістемелік кеңес отырысында бекітілді,    </w:t>
+      </w:r>
+      <w:r>
+        <w:rPr>
+          <w:highlight w:val="red"/>
+          <w:lang w:val="kk-KZ"/>
+        </w:rPr>
+        <w:t xml:space="preserve">26.03.</w:t>
+      </w:r>
+      <w:r>
+        <w:rPr>
+          <w:highlight w:val="red"/>
           <w:lang w:val="en-US"/>
         </w:rPr>
         <w:t xml:space="preserve">[YEAR]</w:t>
       </w:r>
       <w:r>
         <w:rPr>
+          <w:highlight w:val="red"/>
           <w:lang w:val="kk-KZ"/>
         </w:rPr>
         <w:t xml:space="preserve"> ж. № 6 хаттама.</w:t>
       </w:r>
       <w:r>
         <w:rPr>
+          <w:highlight w:val="red"/>
           <w:lang w:val="kk-KZ"/>
         </w:rPr>
       </w:r>
@@ -2411,39 +2451,58 @@
         <w:t xml:space="preserve">Дулатова</w:t>
       </w:r>
       <w:r>
-        <w:t xml:space="preserve">, протокол от 2</w:t>
-      </w:r>
-      <w:r>
-        <w:rPr>
+        <w:t xml:space="preserve">, протокол от </w:t>
+      </w:r>
+      <w:r>
+        <w:rPr>
+          <w:highlight w:val="red"/>
+        </w:rPr>
+        <w:t xml:space="preserve">2</w:t>
+      </w:r>
+      <w:r>
+        <w:rPr>
+          <w:highlight w:val="red"/>
           <w:lang w:val="kk-KZ"/>
         </w:rPr>
         <w:t xml:space="preserve">6</w:t>
       </w:r>
       <w:r>
+        <w:rPr>
+          <w:highlight w:val="red"/>
+        </w:rPr>
         <w:t xml:space="preserve">.03.</w:t>
       </w:r>
       <w:r>
         <w:rPr>
+          <w:highlight w:val="red"/>
           <w:lang w:val="en-US"/>
         </w:rPr>
         <w:t xml:space="preserve">[YEAR] </w:t>
       </w:r>
       <w:r>
         <w:rPr>
+          <w:highlight w:val="red"/>
           <w:lang w:val="en-US"/>
         </w:rPr>
         <w:t xml:space="preserve"> </w:t>
       </w:r>
       <w:r>
+        <w:rPr>
+          <w:highlight w:val="red"/>
+        </w:rPr>
         <w:t xml:space="preserve">г. № </w:t>
       </w:r>
       <w:r>
         <w:rPr>
+          <w:highlight w:val="red"/>
           <w:lang w:val="kk-KZ"/>
         </w:rPr>
         <w:t xml:space="preserve">6</w:t>
       </w:r>
       <w:r>
+        <w:rPr>
+          <w:highlight w:val="red"/>
+        </w:rPr>
         <w:t xml:space="preserve">.</w:t>
       </w:r>
       <w:r/>
@@ -9222,11 +9281,19 @@
         <w:rPr>
           <w:lang w:val="kk-KZ"/>
         </w:rPr>
-        <w:t xml:space="preserve">білім беру бағдарламасы бойынша ақпараттық-коммуникациялық технологиялар саласындағы бакалавры</w:t>
+        <w:t xml:space="preserve">білім беру бағдарламасы бойынша </w:t>
+      </w:r>
+      <w:r>
+        <w:rPr>
+          <w:highlight w:val="red"/>
+          <w:lang w:val="kk-KZ"/>
+        </w:rPr>
+        <w:t xml:space="preserve">ақпараттық-коммуникациялық технологиялар саласындағы бакалавры</w:t>
       </w:r>
       <w:r>
         <w:rPr>
           <w:b/>
+          <w:highlight w:val="red"/>
           <w:lang w:val="kk-KZ"/>
         </w:rPr>
       </w:r>
@@ -9266,7 +9333,20 @@
         <w:rPr>
           <w:lang w:val="kk-KZ"/>
         </w:rPr>
-        <w:t xml:space="preserve"> бакалавр в области информационно-коммуникационных технологий по образовательной программе </w:t>
+        <w:t xml:space="preserve"> </w:t>
+      </w:r>
+      <w:r>
+        <w:rPr>
+          <w:highlight w:val="red"/>
+          <w:lang w:val="kk-KZ"/>
+        </w:rPr>
+        <w:t xml:space="preserve">бакалавр в области информационно-коммуникационных технологий</w:t>
+      </w:r>
+      <w:r>
+        <w:rPr>
+          <w:lang w:val="kk-KZ"/>
+        </w:rPr>
+        <w:t xml:space="preserve"> по образовательной программе </w:t>
       </w:r>
       <w:r>
         <w:rPr>
@@ -9529,6 +9609,8 @@
       <w:r>
         <w:rPr>
           <w:b/>
+          <w:bCs/>
+          <w:highlight w:val="none"/>
         </w:rPr>
       </w:r>
     </w:p>
@@ -9558,7 +9640,7 @@
       <w:r>
         <w:rPr>
           <w:b/>
-          <w:highlight w:val="none"/>
+          <w:bCs/>
         </w:rPr>
       </w:r>
     </w:p>
@@ -9626,6 +9708,8 @@
       <w:r>
         <w:rPr>
           <w:b/>
+          <w:bCs/>
+          <w:highlight w:val="none"/>
           <w:lang w:val="kk-KZ"/>
         </w:rPr>
       </w:r>
@@ -9653,13 +9737,13 @@
         <w:rPr>
           <w:b/>
           <w:highlight w:val="none"/>
-          <w:lang w:val="kk-KZ" w:bidi="kk-KZ"/>
+          <w:lang w:val="kk-KZ"/>
         </w:rPr>
       </w:r>
       <w:r>
         <w:rPr>
           <w:b/>
-          <w:highlight w:val="none"/>
+          <w:bCs/>
           <w:lang w:val="kk-KZ"/>
         </w:rPr>
       </w:r>
@@ -9728,6 +9812,8 @@
       <w:r>
         <w:rPr>
           <w:b/>
+          <w:bCs/>
+          <w:highlight w:val="none"/>
           <w:lang w:val="kk-KZ"/>
         </w:rPr>
       </w:r>
@@ -9755,13 +9841,13 @@
         <w:rPr>
           <w:b/>
           <w:highlight w:val="none"/>
-          <w:lang w:val="kk-KZ" w:bidi="kk-KZ"/>
+          <w:lang w:val="kk-KZ"/>
         </w:rPr>
       </w:r>
       <w:r>
         <w:rPr>
           <w:b/>
-          <w:highlight w:val="none"/>
+          <w:bCs/>
           <w:lang w:val="kk-KZ"/>
         </w:rPr>
       </w:r>
@@ -9824,6 +9910,8 @@
       <w:r>
         <w:rPr>
           <w:b/>
+          <w:bCs/>
+          <w:highlight w:val="none"/>
           <w:lang w:val="kk-KZ"/>
         </w:rPr>
       </w:r>

</xml_diff>

<commit_message>
Make the page numbers in the table of contents red
</commit_message>
<xml_diff>
--- a/src/ked_builder/templates/ked_template.docx
+++ b/src/ked_builder/templates/ked_template.docx
@@ -473,7 +473,6 @@
                 <w:sz w:val="28"/>
                 <w:szCs w:val="28"/>
                 <w:highlight w:val="red"/>
-                <w:lang w:val="kk-KZ"/>
               </w:rPr>
             </w:r>
           </w:p>
@@ -515,7 +514,6 @@
                 <w:sz w:val="28"/>
                 <w:szCs w:val="28"/>
                 <w:highlight w:val="red"/>
-                <w:lang w:val="kk-KZ"/>
               </w:rPr>
             </w:r>
           </w:p>
@@ -619,7 +617,6 @@
                 <w:sz w:val="28"/>
                 <w:szCs w:val="28"/>
                 <w:highlight w:val="red"/>
-                <w:lang w:val="kk-KZ"/>
               </w:rPr>
             </w:r>
           </w:p>
@@ -2420,7 +2417,6 @@
       </w:r>
       <w:r>
         <w:rPr>
-          <w:highlight w:val="red"/>
           <w:lang w:val="kk-KZ"/>
         </w:rPr>
       </w:r>
@@ -3826,13 +3822,14 @@
               <w:rPr>
                 <w:sz w:val="23"/>
                 <w:szCs w:val="23"/>
-                <w:lang w:val="kk-KZ"/>
+                <w:highlight w:val="red"/>
               </w:rPr>
             </w:pPr>
             <w:r>
               <w:rPr>
                 <w:sz w:val="23"/>
                 <w:szCs w:val="23"/>
+                <w:highlight w:val="red"/>
               </w:rPr>
               <w:t xml:space="preserve">4</w:t>
             </w:r>
@@ -3840,6 +3837,7 @@
               <w:rPr>
                 <w:sz w:val="23"/>
                 <w:szCs w:val="23"/>
+                <w:highlight w:val="red"/>
                 <w:lang w:val="kk-KZ"/>
               </w:rPr>
             </w:r>
@@ -3847,6 +3845,7 @@
               <w:rPr>
                 <w:sz w:val="23"/>
                 <w:szCs w:val="23"/>
+                <w:highlight w:val="red"/>
                 <w:lang w:val="kk-KZ"/>
               </w:rPr>
             </w:r>
@@ -4129,13 +4128,14 @@
               <w:rPr>
                 <w:sz w:val="23"/>
                 <w:szCs w:val="23"/>
-                <w:lang w:eastAsia="en-US"/>
+                <w:highlight w:val="red"/>
               </w:rPr>
             </w:pPr>
             <w:r>
               <w:rPr>
                 <w:sz w:val="23"/>
                 <w:szCs w:val="23"/>
+                <w:highlight w:val="red"/>
                 <w:lang w:eastAsia="en-US"/>
               </w:rPr>
               <w:t xml:space="preserve">6</w:t>
@@ -4144,6 +4144,7 @@
               <w:rPr>
                 <w:sz w:val="23"/>
                 <w:szCs w:val="23"/>
+                <w:highlight w:val="red"/>
                 <w:lang w:eastAsia="en-US"/>
               </w:rPr>
             </w:r>
@@ -4151,6 +4152,7 @@
               <w:rPr>
                 <w:sz w:val="23"/>
                 <w:szCs w:val="23"/>
+                <w:highlight w:val="red"/>
                 <w:lang w:eastAsia="en-US"/>
               </w:rPr>
             </w:r>
@@ -4585,13 +4587,14 @@
               <w:rPr>
                 <w:sz w:val="23"/>
                 <w:szCs w:val="23"/>
-                <w:lang w:eastAsia="en-US"/>
+                <w:highlight w:val="red"/>
               </w:rPr>
             </w:pPr>
             <w:r>
               <w:rPr>
                 <w:sz w:val="23"/>
                 <w:szCs w:val="23"/>
+                <w:highlight w:val="red"/>
                 <w:lang w:eastAsia="en-US"/>
               </w:rPr>
             </w:r>
@@ -4599,6 +4602,7 @@
               <w:rPr>
                 <w:sz w:val="23"/>
                 <w:szCs w:val="23"/>
+                <w:highlight w:val="red"/>
                 <w:lang w:eastAsia="en-US"/>
               </w:rPr>
             </w:r>
@@ -4606,6 +4610,7 @@
               <w:rPr>
                 <w:sz w:val="23"/>
                 <w:szCs w:val="23"/>
+                <w:highlight w:val="red"/>
                 <w:lang w:eastAsia="en-US"/>
               </w:rPr>
             </w:r>
@@ -4619,13 +4624,14 @@
               <w:rPr>
                 <w:sz w:val="23"/>
                 <w:szCs w:val="23"/>
-                <w:lang w:eastAsia="en-US"/>
+                <w:highlight w:val="red"/>
               </w:rPr>
             </w:pPr>
             <w:r>
               <w:rPr>
                 <w:sz w:val="23"/>
                 <w:szCs w:val="23"/>
+                <w:highlight w:val="red"/>
                 <w:lang w:eastAsia="en-US"/>
               </w:rPr>
               <w:t xml:space="preserve">6</w:t>
@@ -4634,6 +4640,7 @@
               <w:rPr>
                 <w:sz w:val="23"/>
                 <w:szCs w:val="23"/>
+                <w:highlight w:val="red"/>
                 <w:lang w:eastAsia="en-US"/>
               </w:rPr>
             </w:r>
@@ -4641,6 +4648,7 @@
               <w:rPr>
                 <w:sz w:val="23"/>
                 <w:szCs w:val="23"/>
+                <w:highlight w:val="red"/>
                 <w:lang w:eastAsia="en-US"/>
               </w:rPr>
             </w:r>
@@ -5042,13 +5050,14 @@
               <w:rPr>
                 <w:sz w:val="23"/>
                 <w:szCs w:val="23"/>
-                <w:lang w:eastAsia="en-US"/>
+                <w:highlight w:val="red"/>
               </w:rPr>
             </w:pPr>
             <w:r>
               <w:rPr>
                 <w:sz w:val="23"/>
                 <w:szCs w:val="23"/>
+                <w:highlight w:val="red"/>
                 <w:lang w:eastAsia="en-US"/>
               </w:rPr>
             </w:r>
@@ -5056,6 +5065,7 @@
               <w:rPr>
                 <w:sz w:val="23"/>
                 <w:szCs w:val="23"/>
+                <w:highlight w:val="red"/>
                 <w:lang w:eastAsia="en-US"/>
               </w:rPr>
             </w:r>
@@ -5063,6 +5073,7 @@
               <w:rPr>
                 <w:sz w:val="23"/>
                 <w:szCs w:val="23"/>
+                <w:highlight w:val="red"/>
                 <w:lang w:eastAsia="en-US"/>
               </w:rPr>
             </w:r>
@@ -5076,13 +5087,14 @@
               <w:rPr>
                 <w:sz w:val="23"/>
                 <w:szCs w:val="23"/>
-                <w:lang w:eastAsia="en-US"/>
+                <w:highlight w:val="red"/>
               </w:rPr>
             </w:pPr>
             <w:r>
               <w:rPr>
                 <w:sz w:val="23"/>
                 <w:szCs w:val="23"/>
+                <w:highlight w:val="red"/>
                 <w:lang w:eastAsia="en-US"/>
               </w:rPr>
               <w:t xml:space="preserve">7</w:t>
@@ -5091,6 +5103,7 @@
               <w:rPr>
                 <w:sz w:val="23"/>
                 <w:szCs w:val="23"/>
+                <w:highlight w:val="red"/>
                 <w:lang w:eastAsia="en-US"/>
               </w:rPr>
             </w:r>
@@ -5098,6 +5111,7 @@
               <w:rPr>
                 <w:sz w:val="23"/>
                 <w:szCs w:val="23"/>
+                <w:highlight w:val="red"/>
                 <w:lang w:eastAsia="en-US"/>
               </w:rPr>
             </w:r>
@@ -5513,13 +5527,14 @@
               <w:rPr>
                 <w:sz w:val="23"/>
                 <w:szCs w:val="23"/>
-                <w:lang w:eastAsia="en-US"/>
+                <w:highlight w:val="red"/>
               </w:rPr>
             </w:pPr>
             <w:r>
               <w:rPr>
                 <w:sz w:val="23"/>
                 <w:szCs w:val="23"/>
+                <w:highlight w:val="red"/>
                 <w:lang w:eastAsia="en-US"/>
               </w:rPr>
             </w:r>
@@ -5527,6 +5542,7 @@
               <w:rPr>
                 <w:sz w:val="23"/>
                 <w:szCs w:val="23"/>
+                <w:highlight w:val="red"/>
                 <w:lang w:eastAsia="en-US"/>
               </w:rPr>
             </w:r>
@@ -5534,6 +5550,7 @@
               <w:rPr>
                 <w:sz w:val="23"/>
                 <w:szCs w:val="23"/>
+                <w:highlight w:val="red"/>
                 <w:lang w:eastAsia="en-US"/>
               </w:rPr>
             </w:r>
@@ -5547,13 +5564,14 @@
               <w:rPr>
                 <w:sz w:val="23"/>
                 <w:szCs w:val="23"/>
-                <w:lang w:eastAsia="en-US"/>
+                <w:highlight w:val="red"/>
               </w:rPr>
             </w:pPr>
             <w:r>
               <w:rPr>
                 <w:sz w:val="23"/>
                 <w:szCs w:val="23"/>
+                <w:highlight w:val="red"/>
                 <w:lang w:eastAsia="en-US"/>
               </w:rPr>
               <w:t xml:space="preserve">8</w:t>
@@ -5562,6 +5580,7 @@
               <w:rPr>
                 <w:sz w:val="23"/>
                 <w:szCs w:val="23"/>
+                <w:highlight w:val="red"/>
                 <w:lang w:eastAsia="en-US"/>
               </w:rPr>
             </w:r>
@@ -5569,6 +5588,7 @@
               <w:rPr>
                 <w:sz w:val="23"/>
                 <w:szCs w:val="23"/>
+                <w:highlight w:val="red"/>
                 <w:lang w:eastAsia="en-US"/>
               </w:rPr>
             </w:r>
@@ -5984,13 +6004,14 @@
               <w:rPr>
                 <w:sz w:val="23"/>
                 <w:szCs w:val="23"/>
-                <w:lang w:eastAsia="en-US"/>
+                <w:highlight w:val="red"/>
               </w:rPr>
             </w:pPr>
             <w:r>
               <w:rPr>
                 <w:sz w:val="23"/>
                 <w:szCs w:val="23"/>
+                <w:highlight w:val="red"/>
                 <w:lang w:eastAsia="en-US"/>
               </w:rPr>
             </w:r>
@@ -5998,6 +6019,7 @@
               <w:rPr>
                 <w:sz w:val="23"/>
                 <w:szCs w:val="23"/>
+                <w:highlight w:val="red"/>
                 <w:lang w:eastAsia="en-US"/>
               </w:rPr>
             </w:r>
@@ -6005,6 +6027,7 @@
               <w:rPr>
                 <w:sz w:val="23"/>
                 <w:szCs w:val="23"/>
+                <w:highlight w:val="red"/>
                 <w:lang w:eastAsia="en-US"/>
               </w:rPr>
             </w:r>
@@ -6018,13 +6041,14 @@
               <w:rPr>
                 <w:sz w:val="23"/>
                 <w:szCs w:val="23"/>
-                <w:lang w:eastAsia="en-US"/>
+                <w:highlight w:val="red"/>
               </w:rPr>
             </w:pPr>
             <w:r>
               <w:rPr>
                 <w:sz w:val="23"/>
                 <w:szCs w:val="23"/>
+                <w:highlight w:val="red"/>
                 <w:lang w:eastAsia="en-US"/>
               </w:rPr>
               <w:t xml:space="preserve">9</w:t>
@@ -6033,6 +6057,7 @@
               <w:rPr>
                 <w:sz w:val="23"/>
                 <w:szCs w:val="23"/>
+                <w:highlight w:val="red"/>
                 <w:lang w:eastAsia="en-US"/>
               </w:rPr>
             </w:r>
@@ -6040,6 +6065,7 @@
               <w:rPr>
                 <w:sz w:val="23"/>
                 <w:szCs w:val="23"/>
+                <w:highlight w:val="red"/>
                 <w:lang w:eastAsia="en-US"/>
               </w:rPr>
             </w:r>
@@ -6333,13 +6359,14 @@
               <w:rPr>
                 <w:sz w:val="23"/>
                 <w:szCs w:val="23"/>
-                <w:lang w:eastAsia="en-US"/>
+                <w:highlight w:val="red"/>
               </w:rPr>
             </w:pPr>
             <w:r>
               <w:rPr>
                 <w:sz w:val="23"/>
                 <w:szCs w:val="23"/>
+                <w:highlight w:val="red"/>
                 <w:lang w:eastAsia="en-US"/>
               </w:rPr>
             </w:r>
@@ -6347,6 +6374,7 @@
               <w:rPr>
                 <w:sz w:val="23"/>
                 <w:szCs w:val="23"/>
+                <w:highlight w:val="red"/>
                 <w:lang w:eastAsia="en-US"/>
               </w:rPr>
             </w:r>
@@ -6354,6 +6382,7 @@
               <w:rPr>
                 <w:sz w:val="23"/>
                 <w:szCs w:val="23"/>
+                <w:highlight w:val="red"/>
                 <w:lang w:eastAsia="en-US"/>
               </w:rPr>
             </w:r>
@@ -6367,13 +6396,14 @@
               <w:rPr>
                 <w:sz w:val="23"/>
                 <w:szCs w:val="23"/>
-                <w:lang w:eastAsia="en-US"/>
+                <w:highlight w:val="red"/>
               </w:rPr>
             </w:pPr>
             <w:r>
               <w:rPr>
                 <w:sz w:val="23"/>
                 <w:szCs w:val="23"/>
+                <w:highlight w:val="red"/>
                 <w:lang w:eastAsia="en-US"/>
               </w:rPr>
               <w:t xml:space="preserve">1</w:t>
@@ -6382,6 +6412,7 @@
               <w:rPr>
                 <w:sz w:val="23"/>
                 <w:szCs w:val="23"/>
+                <w:highlight w:val="red"/>
                 <w:lang w:eastAsia="en-US"/>
               </w:rPr>
               <w:t xml:space="preserve">1</w:t>
@@ -6390,6 +6421,7 @@
               <w:rPr>
                 <w:sz w:val="23"/>
                 <w:szCs w:val="23"/>
+                <w:highlight w:val="red"/>
                 <w:lang w:eastAsia="en-US"/>
               </w:rPr>
             </w:r>
@@ -6397,6 +6429,7 @@
               <w:rPr>
                 <w:sz w:val="23"/>
                 <w:szCs w:val="23"/>
+                <w:highlight w:val="red"/>
                 <w:lang w:eastAsia="en-US"/>
               </w:rPr>
             </w:r>
@@ -6639,13 +6672,14 @@
               <w:rPr>
                 <w:sz w:val="23"/>
                 <w:szCs w:val="23"/>
-                <w:lang w:eastAsia="en-US"/>
+                <w:highlight w:val="red"/>
               </w:rPr>
             </w:pPr>
             <w:r>
               <w:rPr>
                 <w:sz w:val="23"/>
                 <w:szCs w:val="23"/>
+                <w:highlight w:val="red"/>
                 <w:lang w:eastAsia="en-US"/>
               </w:rPr>
             </w:r>
@@ -6653,6 +6687,7 @@
               <w:rPr>
                 <w:sz w:val="23"/>
                 <w:szCs w:val="23"/>
+                <w:highlight w:val="red"/>
                 <w:lang w:eastAsia="en-US"/>
               </w:rPr>
             </w:r>
@@ -6660,6 +6695,7 @@
               <w:rPr>
                 <w:sz w:val="23"/>
                 <w:szCs w:val="23"/>
+                <w:highlight w:val="red"/>
                 <w:lang w:eastAsia="en-US"/>
               </w:rPr>
             </w:r>
@@ -6673,13 +6709,14 @@
               <w:rPr>
                 <w:sz w:val="23"/>
                 <w:szCs w:val="23"/>
-                <w:lang w:eastAsia="en-US"/>
+                <w:highlight w:val="red"/>
               </w:rPr>
             </w:pPr>
             <w:r>
               <w:rPr>
                 <w:sz w:val="23"/>
                 <w:szCs w:val="23"/>
+                <w:highlight w:val="red"/>
                 <w:lang w:eastAsia="en-US"/>
               </w:rPr>
               <w:t xml:space="preserve">1</w:t>
@@ -6688,6 +6725,7 @@
               <w:rPr>
                 <w:sz w:val="23"/>
                 <w:szCs w:val="23"/>
+                <w:highlight w:val="red"/>
                 <w:lang w:eastAsia="en-US"/>
               </w:rPr>
               <w:t xml:space="preserve">1</w:t>
@@ -6696,6 +6734,7 @@
               <w:rPr>
                 <w:sz w:val="23"/>
                 <w:szCs w:val="23"/>
+                <w:highlight w:val="red"/>
                 <w:lang w:eastAsia="en-US"/>
               </w:rPr>
             </w:r>
@@ -6703,6 +6742,7 @@
               <w:rPr>
                 <w:sz w:val="23"/>
                 <w:szCs w:val="23"/>
+                <w:highlight w:val="red"/>
                 <w:lang w:eastAsia="en-US"/>
               </w:rPr>
             </w:r>
@@ -6918,13 +6958,14 @@
               <w:rPr>
                 <w:sz w:val="23"/>
                 <w:szCs w:val="23"/>
-                <w:lang w:eastAsia="en-US"/>
+                <w:highlight w:val="red"/>
               </w:rPr>
             </w:pPr>
             <w:r>
               <w:rPr>
                 <w:sz w:val="23"/>
                 <w:szCs w:val="23"/>
+                <w:highlight w:val="red"/>
                 <w:lang w:eastAsia="en-US"/>
               </w:rPr>
               <w:t xml:space="preserve">1</w:t>
@@ -6933,6 +6974,7 @@
               <w:rPr>
                 <w:sz w:val="23"/>
                 <w:szCs w:val="23"/>
+                <w:highlight w:val="red"/>
                 <w:lang w:eastAsia="en-US"/>
               </w:rPr>
               <w:t xml:space="preserve">4</w:t>
@@ -6941,6 +6983,7 @@
               <w:rPr>
                 <w:sz w:val="23"/>
                 <w:szCs w:val="23"/>
+                <w:highlight w:val="red"/>
                 <w:lang w:eastAsia="en-US"/>
               </w:rPr>
             </w:r>
@@ -6948,6 +6991,7 @@
               <w:rPr>
                 <w:sz w:val="23"/>
                 <w:szCs w:val="23"/>
+                <w:highlight w:val="red"/>
                 <w:lang w:eastAsia="en-US"/>
               </w:rPr>
             </w:r>
@@ -9293,7 +9337,6 @@
       <w:r>
         <w:rPr>
           <w:b/>
-          <w:highlight w:val="red"/>
           <w:lang w:val="kk-KZ"/>
         </w:rPr>
       </w:r>
@@ -9604,6 +9647,8 @@
       <w:r>
         <w:rPr>
           <w:b/>
+          <w:bCs/>
+          <w:highlight w:val="none"/>
         </w:rPr>
       </w:r>
       <w:r>
@@ -9634,7 +9679,7 @@
       <w:r>
         <w:rPr>
           <w:b/>
-          <w:highlight w:val="none"/>
+          <w:bCs/>
         </w:rPr>
       </w:r>
       <w:r>
@@ -9702,6 +9747,8 @@
       <w:r>
         <w:rPr>
           <w:b/>
+          <w:bCs/>
+          <w:highlight w:val="none"/>
           <w:lang w:val="kk-KZ"/>
         </w:rPr>
       </w:r>
@@ -9736,7 +9783,7 @@
       <w:r>
         <w:rPr>
           <w:b/>
-          <w:highlight w:val="none"/>
+          <w:bCs/>
           <w:lang w:val="kk-KZ"/>
         </w:rPr>
       </w:r>
@@ -9806,6 +9853,8 @@
       <w:r>
         <w:rPr>
           <w:b/>
+          <w:bCs/>
+          <w:highlight w:val="none"/>
           <w:lang w:val="kk-KZ"/>
         </w:rPr>
       </w:r>
@@ -9840,7 +9889,7 @@
       <w:r>
         <w:rPr>
           <w:b/>
-          <w:highlight w:val="none"/>
+          <w:bCs/>
           <w:lang w:val="kk-KZ"/>
         </w:rPr>
       </w:r>

</xml_diff>